<commit_message>
feat: use administration details in advice reports
Adds Adviesbureau/Adres/Telefoon/E-mail rows to the metatable in all
three report templates (basis-quickscan/premium/gold), filled from
factuur_instellingen (Administratie Instellingen) via the existing
label-matching mechanism — same source Offerte/Factuur already use.
Financial-only fields (KvK, btw-id, IBAN, payment terms) are
deliberately excluded. Logo and rest of the templates are unchanged.

Co-Authored-By: Claude Sonnet 5 <noreply@anthropic.com>
Claude-Session: https://claude.ai/code/session_01CsyPEKMeWLvPZXEK5K6MKQ
</commit_message>
<xml_diff>
--- a/src/assets/rapportTemplates/basis-quickscan.docx
+++ b/src/assets/rapportTemplates/basis-quickscan.docx
@@ -402,6 +402,230 @@
                 <w:szCs w:val="18"/>
               </w:rPr>
               <w:t xml:space="preserve">Rapportnummer</w:t>
+            </w:r>
+          </w:p>
+        </w:tc>
+        <w:tc>
+          <w:tcPr>
+            <w:tcW w:type="dxa" w:w="2339"/>
+            <w:tcBorders>
+              <w:top w:val="single" w:color="B9C4CC" w:sz="2"/>
+              <w:left w:val="single" w:color="B9C4CC" w:sz="2"/>
+              <w:bottom w:val="single" w:color="B9C4CC" w:sz="2"/>
+              <w:right w:val="single" w:color="B9C4CC" w:sz="2"/>
+            </w:tcBorders>
+            <w:tcMar>
+              <w:top w:type="dxa" w:w="80"/>
+              <w:left w:type="dxa" w:w="100"/>
+              <w:bottom w:type="dxa" w:w="80"/>
+              <w:right w:type="dxa" w:w="100"/>
+            </w:tcMar>
+          </w:tcPr>
+          <w:p>
+            <w:r>
+              <w:rPr>
+                <w:sz w:val="18"/>
+                <w:szCs w:val="18"/>
+              </w:rPr>
+              <w:t xml:space="preserve"/>
+            </w:r>
+          </w:p>
+        </w:tc>
+      </w:tr>
+      <w:tr>
+        <w:tc>
+          <w:tcPr>
+            <w:tcW w:type="dxa" w:w="2339"/>
+            <w:tcBorders>
+              <w:top w:val="single" w:color="B9C4CC" w:sz="2"/>
+              <w:left w:val="single" w:color="B9C4CC" w:sz="2"/>
+              <w:bottom w:val="single" w:color="B9C4CC" w:sz="2"/>
+              <w:right w:val="single" w:color="B9C4CC" w:sz="2"/>
+            </w:tcBorders>
+            <w:shd w:fill="EAF0F4" w:color="auto" w:val="clear"/>
+            <w:tcMar>
+              <w:top w:type="dxa" w:w="80"/>
+              <w:left w:type="dxa" w:w="100"/>
+              <w:bottom w:type="dxa" w:w="80"/>
+              <w:right w:type="dxa" w:w="100"/>
+            </w:tcMar>
+          </w:tcPr>
+          <w:p>
+            <w:r>
+              <w:rPr>
+                <w:b/>
+                <w:bCs/>
+                <w:sz w:val="18"/>
+                <w:szCs w:val="18"/>
+              </w:rPr>
+              <w:t xml:space="preserve">Adviesbureau</w:t>
+            </w:r>
+          </w:p>
+        </w:tc>
+        <w:tc>
+          <w:tcPr>
+            <w:tcW w:type="dxa" w:w="2339"/>
+            <w:tcBorders>
+              <w:top w:val="single" w:color="B9C4CC" w:sz="2"/>
+              <w:left w:val="single" w:color="B9C4CC" w:sz="2"/>
+              <w:bottom w:val="single" w:color="B9C4CC" w:sz="2"/>
+              <w:right w:val="single" w:color="B9C4CC" w:sz="2"/>
+            </w:tcBorders>
+            <w:tcMar>
+              <w:top w:type="dxa" w:w="80"/>
+              <w:left w:type="dxa" w:w="100"/>
+              <w:bottom w:type="dxa" w:w="80"/>
+              <w:right w:type="dxa" w:w="100"/>
+            </w:tcMar>
+          </w:tcPr>
+          <w:p>
+            <w:r>
+              <w:rPr>
+                <w:sz w:val="18"/>
+                <w:szCs w:val="18"/>
+              </w:rPr>
+              <w:t xml:space="preserve"/>
+            </w:r>
+          </w:p>
+        </w:tc>
+        <w:tc>
+          <w:tcPr>
+            <w:tcW w:type="dxa" w:w="2339"/>
+            <w:tcBorders>
+              <w:top w:val="single" w:color="B9C4CC" w:sz="2"/>
+              <w:left w:val="single" w:color="B9C4CC" w:sz="2"/>
+              <w:bottom w:val="single" w:color="B9C4CC" w:sz="2"/>
+              <w:right w:val="single" w:color="B9C4CC" w:sz="2"/>
+            </w:tcBorders>
+            <w:shd w:fill="EAF0F4" w:color="auto" w:val="clear"/>
+            <w:tcMar>
+              <w:top w:type="dxa" w:w="80"/>
+              <w:left w:type="dxa" w:w="100"/>
+              <w:bottom w:type="dxa" w:w="80"/>
+              <w:right w:type="dxa" w:w="100"/>
+            </w:tcMar>
+          </w:tcPr>
+          <w:p>
+            <w:r>
+              <w:rPr>
+                <w:b/>
+                <w:bCs/>
+                <w:sz w:val="18"/>
+                <w:szCs w:val="18"/>
+              </w:rPr>
+              <w:t xml:space="preserve">Adres adviesbureau</w:t>
+            </w:r>
+          </w:p>
+        </w:tc>
+        <w:tc>
+          <w:tcPr>
+            <w:tcW w:type="dxa" w:w="2339"/>
+            <w:tcBorders>
+              <w:top w:val="single" w:color="B9C4CC" w:sz="2"/>
+              <w:left w:val="single" w:color="B9C4CC" w:sz="2"/>
+              <w:bottom w:val="single" w:color="B9C4CC" w:sz="2"/>
+              <w:right w:val="single" w:color="B9C4CC" w:sz="2"/>
+            </w:tcBorders>
+            <w:tcMar>
+              <w:top w:type="dxa" w:w="80"/>
+              <w:left w:type="dxa" w:w="100"/>
+              <w:bottom w:type="dxa" w:w="80"/>
+              <w:right w:type="dxa" w:w="100"/>
+            </w:tcMar>
+          </w:tcPr>
+          <w:p>
+            <w:r>
+              <w:rPr>
+                <w:sz w:val="18"/>
+                <w:szCs w:val="18"/>
+              </w:rPr>
+              <w:t xml:space="preserve"/>
+            </w:r>
+          </w:p>
+        </w:tc>
+      </w:tr>
+      <w:tr>
+        <w:tc>
+          <w:tcPr>
+            <w:tcW w:type="dxa" w:w="2339"/>
+            <w:tcBorders>
+              <w:top w:val="single" w:color="B9C4CC" w:sz="2"/>
+              <w:left w:val="single" w:color="B9C4CC" w:sz="2"/>
+              <w:bottom w:val="single" w:color="B9C4CC" w:sz="2"/>
+              <w:right w:val="single" w:color="B9C4CC" w:sz="2"/>
+            </w:tcBorders>
+            <w:shd w:fill="EAF0F4" w:color="auto" w:val="clear"/>
+            <w:tcMar>
+              <w:top w:type="dxa" w:w="80"/>
+              <w:left w:type="dxa" w:w="100"/>
+              <w:bottom w:type="dxa" w:w="80"/>
+              <w:right w:type="dxa" w:w="100"/>
+            </w:tcMar>
+          </w:tcPr>
+          <w:p>
+            <w:r>
+              <w:rPr>
+                <w:b/>
+                <w:bCs/>
+                <w:sz w:val="18"/>
+                <w:szCs w:val="18"/>
+              </w:rPr>
+              <w:t xml:space="preserve">Telefoon adviesbureau</w:t>
+            </w:r>
+          </w:p>
+        </w:tc>
+        <w:tc>
+          <w:tcPr>
+            <w:tcW w:type="dxa" w:w="2339"/>
+            <w:tcBorders>
+              <w:top w:val="single" w:color="B9C4CC" w:sz="2"/>
+              <w:left w:val="single" w:color="B9C4CC" w:sz="2"/>
+              <w:bottom w:val="single" w:color="B9C4CC" w:sz="2"/>
+              <w:right w:val="single" w:color="B9C4CC" w:sz="2"/>
+            </w:tcBorders>
+            <w:tcMar>
+              <w:top w:type="dxa" w:w="80"/>
+              <w:left w:type="dxa" w:w="100"/>
+              <w:bottom w:type="dxa" w:w="80"/>
+              <w:right w:type="dxa" w:w="100"/>
+            </w:tcMar>
+          </w:tcPr>
+          <w:p>
+            <w:r>
+              <w:rPr>
+                <w:sz w:val="18"/>
+                <w:szCs w:val="18"/>
+              </w:rPr>
+              <w:t xml:space="preserve"/>
+            </w:r>
+          </w:p>
+        </w:tc>
+        <w:tc>
+          <w:tcPr>
+            <w:tcW w:type="dxa" w:w="2339"/>
+            <w:tcBorders>
+              <w:top w:val="single" w:color="B9C4CC" w:sz="2"/>
+              <w:left w:val="single" w:color="B9C4CC" w:sz="2"/>
+              <w:bottom w:val="single" w:color="B9C4CC" w:sz="2"/>
+              <w:right w:val="single" w:color="B9C4CC" w:sz="2"/>
+            </w:tcBorders>
+            <w:shd w:fill="EAF0F4" w:color="auto" w:val="clear"/>
+            <w:tcMar>
+              <w:top w:type="dxa" w:w="80"/>
+              <w:left w:type="dxa" w:w="100"/>
+              <w:bottom w:type="dxa" w:w="80"/>
+              <w:right w:type="dxa" w:w="100"/>
+            </w:tcMar>
+          </w:tcPr>
+          <w:p>
+            <w:r>
+              <w:rPr>
+                <w:b/>
+                <w:bCs/>
+                <w:sz w:val="18"/>
+                <w:szCs w:val="18"/>
+              </w:rPr>
+              <w:t xml:space="preserve">E-mail adviesbureau</w:t>
             </w:r>
           </w:p>
         </w:tc>

</xml_diff>